<commit_message>
Ajout de logo depuis Brand
</commit_message>
<xml_diff>
--- a/_extensions/lettre/docx/reference.docx
+++ b/_extensions/lettre/docx/reference.docx
@@ -1558,6 +1558,27 @@
       </w:tcPr>
     </w:tblStylePr>
   </w:style>
+  <w:style w:type="paragraph" w:customStyle="1" w:styleId="LetterHeader">
+    <w:name w:val="Letter Header"/>
+    <w:pPr>
+      <w:spacing w:before="0" w:after="320"/>
+      <w:jc w:val="center"/>
+    </w:pPr>
+    <w:rPr>
+      <w:sz w:val="22"/>
+    </w:rPr>
+  </w:style>
+  <w:style w:type="paragraph" w:customStyle="1" w:styleId="LetterFooter">
+    <w:name w:val="Letter Footer"/>
+    <w:pPr>
+      <w:spacing w:before="320" w:after="0"/>
+      <w:jc w:val="center"/>
+    </w:pPr>
+    <w:rPr>
+      <w:color w:val="555555"/>
+      <w:sz w:val="16"/>
+    </w:rPr>
+  </w:style>
 </w:styles>
 </file>
 

</xml_diff>